<commit_message>
Scheduled run 2026-09-25, 3 new drafts (backlog gate under 8, normal cut)
Co-Authored-By: Claude Sonnet 5 <noreply@anthropic.com>
Claude-Session: https://claude.ai/code/session_01DWc2G4LAJq2GBxaWFwQ87z
</commit_message>
<xml_diff>
--- a/drafts/KontextWork Hannover Werkstudent KI Engineer Generative KI LLM/CV_Rahul_Rawat.docx
+++ b/drafts/KontextWork Hannover Werkstudent KI Engineer Generative KI LLM/CV_Rahul_Rawat.docx
@@ -24,7 +24,7 @@
           <w:color w:val="6C7A93"/>
           <w:sz w:val="21"/>
         </w:rPr>
-        <w:t>Masterstudent Data Science and Analytics | Generative KI und RAG Systeme | Python + LangGraph + Automatisierung</w:t>
+        <w:t>Masterstudent Data Science and Analytics | RAG Systeme und LLM Integration | Python + LangGraph + Prompting</w:t>
       </w:r>
     </w:p>
     <w:p>
@@ -95,7 +95,7 @@
           <w:color w:val="1F2937"/>
           <w:sz w:val="21"/>
         </w:rPr>
-        <w:t>Masterstudent der Data Science and Analytics an der SRH Heidelberg mit Sitz in Mannheim und praktischer Erfahrung im Aufbau von RAG Systemen, der Integration von LLMs in bestehende Wissenssysteme und der Automatisierung wiederkehrender Workflows. Ich habe ein Multi Agent RAG System ueber eine mehrsprachige Vektor Datenbank gebaut, das Unternehmenswissen durchsuchbar macht und mit LLM as Judge Evaluation absichert, und in einem Cloud Data Projekt eine Batch Pipeline mit 0 manuellen Eingriffen automatisiert. Sicher in Python, Prompting Techniken und der praktischen Integration von KI Modellen in bestehende Systeme.</w:t>
+        <w:t>Masterstudent der Data Science and Analytics an der SRH Heidelberg mit Sitz in Mannheim und praktischer Erfahrung im Aufbau von RAG Systemen und der Integration von LLMs in bestehende Geschaeftsprozesse. Ich habe ein Multi Agent RAG System mit hybrider BM25 plus Dense Retrieval Pipeline und einem unabhaengigen LLM as Judge Modell gebaut sowie in CreditIQ ein reguliertes Entscheidungsunterstuetzungssystem mit einer klartextlichen LLM generierten Erklaerung ausgeliefert. Sicher in Python, Prompting Techniken und im Uebersetzen von Geschaeftswissen in KI gestuetzte Loesungen.</w:t>
       </w:r>
     </w:p>
     <w:p>
@@ -571,7 +571,7 @@
           <w:color w:val="1F2937"/>
           <w:sz w:val="21"/>
         </w:rPr>
-        <w:t xml:space="preserve"> bei Trübung, ein rollender z-score bei z&gt;</w:t>
+        <w:t xml:space="preserve"> bei Trübung, ein rollender z score bei z&gt;</w:t>
       </w:r>
       <w:r>
         <w:rPr>

</xml_diff>